<commit_message>
Update several Cyrillic-named .docx files
Replace/update multiple Word (.docx) files with Cyrillic filenames (versions 6, 7, 8, 9 and 10). These are binary content changes to the document files (updated .docx binaries) and do not affect source code.
</commit_message>
<xml_diff>
--- a/Алгоритми та структури даних/Розділи/РОЗДІЛ 10  ЖАДІБНІ АЛГОРИТМИ.docx
+++ b/Алгоритми та структури даних/Розділи/РОЗДІЛ 10  ЖАДІБНІ АЛГОРИТМИ.docx
@@ -1,41 +1,637 @@
 
 <file path=word/document.xml><?xml version="1.0" encoding="utf-8"?>
-<w:document xmlns:wpc="http://schemas.microsoft.com/office/word/2010/wordprocessingCanvas" xmlns:cx="http://schemas.microsoft.com/office/drawing/2014/chartex" xmlns:cx1="http://schemas.microsoft.com/office/drawing/2015/9/8/chartex" xmlns:cx2="http://schemas.microsoft.com/office/drawing/2015/10/21/chartex" xmlns:cx3="http://schemas.microsoft.com/office/drawing/2016/5/9/chartex" xmlns:cx4="http://schemas.microsoft.com/office/drawing/2016/5/10/chartex" xmlns:cx5="http://schemas.microsoft.com/office/drawing/2016/5/11/chartex" xmlns:cx6="http://schemas.microsoft.com/office/drawing/2016/5/12/chartex" xmlns:cx7="http://schemas.microsoft.com/office/drawing/2016/5/13/chartex" xmlns:cx8="http://schemas.microsoft.com/office/drawing/2016/5/14/chartex" xmlns:mc="http://schemas.openxmlformats.org/markup-compatibility/2006" xmlns:aink="http://schemas.microsoft.com/office/drawing/2016/ink" xmlns:am3d="http://schemas.microsoft.com/office/drawing/2017/model3d" xmlns:o="urn:schemas-microsoft-com:office:office" xmlns:r="http://schemas.openxmlformats.org/officeDocument/2006/relationships" xmlns:m="http://schemas.openxmlformats.org/officeDocument/2006/math" xmlns:v="urn:schemas-microsoft-com:vml" xmlns:wp14="http://schemas.microsoft.com/office/word/2010/wordprocessingDrawing" xmlns:wp="http://schemas.openxmlformats.org/drawingml/2006/wordprocessingDrawing" xmlns:w10="urn:schemas-microsoft-com:office:word" xmlns:w="http://schemas.openxmlformats.org/wordprocessingml/2006/main" xmlns:w14="http://schemas.microsoft.com/office/word/2010/wordml" xmlns:w15="http://schemas.microsoft.com/office/word/2012/wordml" xmlns:w16cex="http://schemas.microsoft.com/office/word/2018/wordml/cex" xmlns:w16cid="http://schemas.microsoft.com/office/word/2016/wordml/cid" xmlns:w16="http://schemas.microsoft.com/office/word/2018/wordml" xmlns:w16sdtdh="http://schemas.microsoft.com/office/word/2020/wordml/sdtdatahash" xmlns:w16se="http://schemas.microsoft.com/office/word/2015/wordml/symex" xmlns:wpg="http://schemas.microsoft.com/office/word/2010/wordprocessingGroup" xmlns:wpi="http://schemas.microsoft.com/office/word/2010/wordprocessingInk" xmlns:wne="http://schemas.microsoft.com/office/word/2006/wordml" xmlns:wps="http://schemas.microsoft.com/office/word/2010/wordprocessingShape" mc:Ignorable="w14 w15 w16se w16cid w16 w16cex w16sdtdh wp14">
+<w:document xmlns:wpc="http://schemas.microsoft.com/office/word/2010/wordprocessingCanvas" xmlns:cx="http://schemas.microsoft.com/office/drawing/2014/chartex" xmlns:cx1="http://schemas.microsoft.com/office/drawing/2015/9/8/chartex" xmlns:cx2="http://schemas.microsoft.com/office/drawing/2015/10/21/chartex" xmlns:cx3="http://schemas.microsoft.com/office/drawing/2016/5/9/chartex" xmlns:cx4="http://schemas.microsoft.com/office/drawing/2016/5/10/chartex" xmlns:cx5="http://schemas.microsoft.com/office/drawing/2016/5/11/chartex" xmlns:cx6="http://schemas.microsoft.com/office/drawing/2016/5/12/chartex" xmlns:cx7="http://schemas.microsoft.com/office/drawing/2016/5/13/chartex" xmlns:cx8="http://schemas.microsoft.com/office/drawing/2016/5/14/chartex" xmlns:mc="http://schemas.openxmlformats.org/markup-compatibility/2006" xmlns:aink="http://schemas.microsoft.com/office/drawing/2016/ink" xmlns:am3d="http://schemas.microsoft.com/office/drawing/2017/model3d" xmlns:o="urn:schemas-microsoft-com:office:office" xmlns:oel="http://schemas.microsoft.com/office/2019/extlst" xmlns:r="http://schemas.openxmlformats.org/officeDocument/2006/relationships" xmlns:m="http://schemas.openxmlformats.org/officeDocument/2006/math" xmlns:v="urn:schemas-microsoft-com:vml" xmlns:wp14="http://schemas.microsoft.com/office/word/2010/wordprocessingDrawing" xmlns:wp="http://schemas.openxmlformats.org/drawingml/2006/wordprocessingDrawing" xmlns:w10="urn:schemas-microsoft-com:office:word" xmlns:w="http://schemas.openxmlformats.org/wordprocessingml/2006/main" xmlns:w14="http://schemas.microsoft.com/office/word/2010/wordml" xmlns:w15="http://schemas.microsoft.com/office/word/2012/wordml" xmlns:w16cex="http://schemas.microsoft.com/office/word/2018/wordml/cex" xmlns:w16cid="http://schemas.microsoft.com/office/word/2016/wordml/cid" xmlns:w16="http://schemas.microsoft.com/office/word/2018/wordml" xmlns:w16sdtdh="http://schemas.microsoft.com/office/word/2020/wordml/sdtdatahash" xmlns:w16se="http://schemas.microsoft.com/office/word/2015/wordml/symex" xmlns:wpg="http://schemas.microsoft.com/office/word/2010/wordprocessingGroup" xmlns:wpi="http://schemas.microsoft.com/office/word/2010/wordprocessingInk" xmlns:wne="http://schemas.microsoft.com/office/word/2006/wordml" xmlns:wps="http://schemas.microsoft.com/office/word/2010/wordprocessingShape" mc:Ignorable="w14 w15 w16se w16cid w16 w16cex w16sdtdh wp14">
   <w:body>
     <w:p>
       <w:pPr>
-        <w:spacing w:after="0"/>
-        <w:rPr>
-          <w:sz w:val="28"/>
-          <w:szCs w:val="28"/>
-          <w:lang w:val="uk-UA"/>
-        </w:rPr>
-      </w:pPr>
-      <w:r>
-        <w:rPr>
-          <w:sz w:val="28"/>
-          <w:szCs w:val="28"/>
-          <w:lang w:val="uk-UA"/>
-        </w:rPr>
-        <w:t>Ф</w:t>
-      </w:r>
-    </w:p>
-    <w:p>
-      <w:pPr>
-        <w:spacing w:after="0"/>
-        <w:rPr>
-          <w:sz w:val="28"/>
-          <w:szCs w:val="28"/>
-          <w:lang w:val="uk-UA"/>
-        </w:rPr>
-      </w:pPr>
-      <w:r>
-        <w:rPr>
-          <w:sz w:val="28"/>
-          <w:szCs w:val="28"/>
-          <w:lang w:val="uk-UA"/>
-        </w:rPr>
-        <w:t>ф</w:t>
+        <w:rPr>
+          <w:sz w:val="28"/>
+          <w:szCs w:val="28"/>
+          <w:lang w:val="uk-UA"/>
+        </w:rPr>
+      </w:pPr>
+      <w:r>
+        <w:rPr>
+          <w:sz w:val="28"/>
+          <w:szCs w:val="28"/>
+          <w:lang w:val="uk-UA"/>
+        </w:rPr>
+        <w:t>Тести для закріплення матеріалу</w:t>
+      </w:r>
+    </w:p>
+    <w:p>
+      <w:pPr>
+        <w:rPr>
+          <w:sz w:val="28"/>
+          <w:szCs w:val="28"/>
+          <w:lang w:val="uk-UA"/>
+        </w:rPr>
+      </w:pPr>
+    </w:p>
+    <w:p>
+      <w:pPr>
+        <w:rPr>
+          <w:sz w:val="28"/>
+          <w:szCs w:val="28"/>
+          <w:lang w:val="uk-UA"/>
+        </w:rPr>
+      </w:pPr>
+      <w:r>
+        <w:rPr>
+          <w:sz w:val="28"/>
+          <w:szCs w:val="28"/>
+          <w:lang w:val="uk-UA"/>
+        </w:rPr>
+        <w:t>1. За алгоритмом Хафмана знайти двійкові коди букв за таблицею</w:t>
+      </w:r>
+      <w:r>
+        <w:rPr>
+          <w:sz w:val="28"/>
+          <w:szCs w:val="28"/>
+          <w:lang w:val="uk-UA"/>
+        </w:rPr>
+        <w:t xml:space="preserve"> </w:t>
+      </w:r>
+      <w:r>
+        <w:rPr>
+          <w:sz w:val="28"/>
+          <w:szCs w:val="28"/>
+          <w:lang w:val="uk-UA"/>
+        </w:rPr>
+        <w:t>частот:</w:t>
+      </w:r>
+    </w:p>
+    <w:p>
+      <w:pPr>
+        <w:rPr>
+          <w:sz w:val="28"/>
+          <w:szCs w:val="28"/>
+          <w:lang w:val="uk-UA"/>
+        </w:rPr>
+      </w:pPr>
+      <w:r>
+        <w:rPr>
+          <w:sz w:val="28"/>
+          <w:szCs w:val="28"/>
+          <w:lang w:val="uk-UA"/>
+        </w:rPr>
+        <w:t>а) 0,1</w:t>
+      </w:r>
+    </w:p>
+    <w:p>
+      <w:pPr>
+        <w:rPr>
+          <w:sz w:val="28"/>
+          <w:szCs w:val="28"/>
+          <w:lang w:val="uk-UA"/>
+        </w:rPr>
+      </w:pPr>
+      <w:r>
+        <w:rPr>
+          <w:sz w:val="28"/>
+          <w:szCs w:val="28"/>
+          <w:lang w:val="uk-UA"/>
+        </w:rPr>
+        <w:t>б) 0,02</w:t>
+      </w:r>
+    </w:p>
+    <w:p>
+      <w:pPr>
+        <w:rPr>
+          <w:sz w:val="28"/>
+          <w:szCs w:val="28"/>
+          <w:lang w:val="uk-UA"/>
+        </w:rPr>
+      </w:pPr>
+      <w:r>
+        <w:rPr>
+          <w:sz w:val="28"/>
+          <w:szCs w:val="28"/>
+          <w:lang w:val="uk-UA"/>
+        </w:rPr>
+        <w:t>л) 0,03</w:t>
+      </w:r>
+    </w:p>
+    <w:p>
+      <w:pPr>
+        <w:rPr>
+          <w:sz w:val="28"/>
+          <w:szCs w:val="28"/>
+          <w:lang w:val="uk-UA"/>
+        </w:rPr>
+      </w:pPr>
+      <w:r>
+        <w:rPr>
+          <w:sz w:val="28"/>
+          <w:szCs w:val="28"/>
+          <w:lang w:val="uk-UA"/>
+        </w:rPr>
+        <w:t>т) 0,04</w:t>
+      </w:r>
+    </w:p>
+    <w:p>
+      <w:pPr>
+        <w:rPr>
+          <w:sz w:val="28"/>
+          <w:szCs w:val="28"/>
+          <w:lang w:val="uk-UA"/>
+        </w:rPr>
+      </w:pPr>
+      <w:r>
+        <w:rPr>
+          <w:sz w:val="28"/>
+          <w:szCs w:val="28"/>
+          <w:lang w:val="uk-UA"/>
+        </w:rPr>
+        <w:t>у) 0,008</w:t>
+      </w:r>
+    </w:p>
+    <w:p>
+      <w:pPr>
+        <w:rPr>
+          <w:sz w:val="28"/>
+          <w:szCs w:val="28"/>
+          <w:lang w:val="uk-UA"/>
+        </w:rPr>
+      </w:pPr>
+      <w:r>
+        <w:rPr>
+          <w:sz w:val="28"/>
+          <w:szCs w:val="28"/>
+          <w:lang w:val="uk-UA"/>
+        </w:rPr>
+        <w:t>ф) 0,005</w:t>
+      </w:r>
+    </w:p>
+    <w:p>
+      <w:pPr>
+        <w:rPr>
+          <w:sz w:val="28"/>
+          <w:szCs w:val="28"/>
+          <w:lang w:val="uk-UA"/>
+        </w:rPr>
+      </w:pPr>
+      <w:r>
+        <w:rPr>
+          <w:sz w:val="28"/>
+          <w:szCs w:val="28"/>
+          <w:lang w:val="uk-UA"/>
+        </w:rPr>
+        <w:t>ц) 0,003</w:t>
+      </w:r>
+    </w:p>
+    <w:p>
+      <w:pPr>
+        <w:rPr>
+          <w:sz w:val="28"/>
+          <w:szCs w:val="28"/>
+          <w:lang w:val="uk-UA"/>
+        </w:rPr>
+      </w:pPr>
+      <w:r>
+        <w:rPr>
+          <w:sz w:val="28"/>
+          <w:szCs w:val="28"/>
+          <w:lang w:val="uk-UA"/>
+        </w:rPr>
+        <w:t>я) 0,01</w:t>
+      </w:r>
+    </w:p>
+    <w:p>
+      <w:pPr>
+        <w:rPr>
+          <w:sz w:val="28"/>
+          <w:szCs w:val="28"/>
+          <w:lang w:val="uk-UA"/>
+        </w:rPr>
+      </w:pPr>
+    </w:p>
+    <w:p>
+      <w:pPr>
+        <w:rPr>
+          <w:sz w:val="28"/>
+          <w:szCs w:val="28"/>
+          <w:lang w:val="uk-UA"/>
+        </w:rPr>
+      </w:pPr>
+      <w:r>
+        <w:rPr>
+          <w:sz w:val="28"/>
+          <w:szCs w:val="28"/>
+          <w:lang w:val="uk-UA"/>
+        </w:rPr>
+        <w:t>Відповідь:</w:t>
+      </w:r>
+    </w:p>
+    <w:p>
+      <w:pPr>
+        <w:rPr>
+          <w:sz w:val="28"/>
+          <w:szCs w:val="28"/>
+          <w:lang w:val="ru-UA"/>
+        </w:rPr>
+      </w:pPr>
+      <w:r>
+        <w:rPr>
+          <w:sz w:val="28"/>
+          <w:szCs w:val="28"/>
+          <w:lang w:val="ru-UA"/>
+        </w:rPr>
+        <w:t xml:space="preserve">а </w:t>
+      </w:r>
+      <w:r>
+        <w:rPr>
+          <w:sz w:val="28"/>
+          <w:szCs w:val="28"/>
+          <w:lang w:val="ru-UA"/>
+        </w:rPr>
+        <w:t>–</w:t>
+      </w:r>
+      <w:r>
+        <w:rPr>
+          <w:sz w:val="28"/>
+          <w:szCs w:val="28"/>
+          <w:lang w:val="ru-UA"/>
+        </w:rPr>
+        <w:t xml:space="preserve"> 0</w:t>
+      </w:r>
+    </w:p>
+    <w:p>
+      <w:pPr>
+        <w:rPr>
+          <w:sz w:val="28"/>
+          <w:szCs w:val="28"/>
+          <w:lang w:val="ru-UA"/>
+        </w:rPr>
+      </w:pPr>
+      <w:r>
+        <w:rPr>
+          <w:sz w:val="28"/>
+          <w:szCs w:val="28"/>
+          <w:lang w:val="ru-UA"/>
+        </w:rPr>
+        <w:t xml:space="preserve">т </w:t>
+      </w:r>
+      <w:r>
+        <w:rPr>
+          <w:sz w:val="28"/>
+          <w:szCs w:val="28"/>
+          <w:lang w:val="ru-UA"/>
+        </w:rPr>
+        <w:t>–</w:t>
+      </w:r>
+      <w:r>
+        <w:rPr>
+          <w:sz w:val="28"/>
+          <w:szCs w:val="28"/>
+          <w:lang w:val="ru-UA"/>
+        </w:rPr>
+        <w:t xml:space="preserve"> 111</w:t>
+      </w:r>
+    </w:p>
+    <w:p>
+      <w:pPr>
+        <w:rPr>
+          <w:sz w:val="28"/>
+          <w:szCs w:val="28"/>
+          <w:lang w:val="ru-UA"/>
+        </w:rPr>
+      </w:pPr>
+      <w:r>
+        <w:rPr>
+          <w:sz w:val="28"/>
+          <w:szCs w:val="28"/>
+          <w:lang w:val="ru-UA"/>
+        </w:rPr>
+        <w:t xml:space="preserve">л </w:t>
+      </w:r>
+      <w:r>
+        <w:rPr>
+          <w:sz w:val="28"/>
+          <w:szCs w:val="28"/>
+          <w:lang w:val="ru-UA"/>
+        </w:rPr>
+        <w:t>–</w:t>
+      </w:r>
+      <w:r>
+        <w:rPr>
+          <w:sz w:val="28"/>
+          <w:szCs w:val="28"/>
+          <w:lang w:val="ru-UA"/>
+        </w:rPr>
+        <w:t xml:space="preserve"> 101</w:t>
+      </w:r>
+    </w:p>
+    <w:p>
+      <w:pPr>
+        <w:rPr>
+          <w:sz w:val="28"/>
+          <w:szCs w:val="28"/>
+          <w:lang w:val="ru-UA"/>
+        </w:rPr>
+      </w:pPr>
+      <w:r>
+        <w:rPr>
+          <w:sz w:val="28"/>
+          <w:szCs w:val="28"/>
+          <w:lang w:val="ru-UA"/>
+        </w:rPr>
+        <w:t xml:space="preserve">б </w:t>
+      </w:r>
+      <w:r>
+        <w:rPr>
+          <w:sz w:val="28"/>
+          <w:szCs w:val="28"/>
+          <w:lang w:val="ru-UA"/>
+        </w:rPr>
+        <w:t>–</w:t>
+      </w:r>
+      <w:r>
+        <w:rPr>
+          <w:sz w:val="28"/>
+          <w:szCs w:val="28"/>
+          <w:lang w:val="ru-UA"/>
+        </w:rPr>
+        <w:t xml:space="preserve"> 1101</w:t>
+      </w:r>
+    </w:p>
+    <w:p>
+      <w:pPr>
+        <w:rPr>
+          <w:sz w:val="28"/>
+          <w:szCs w:val="28"/>
+          <w:lang w:val="ru-UA"/>
+        </w:rPr>
+      </w:pPr>
+      <w:r>
+        <w:rPr>
+          <w:sz w:val="28"/>
+          <w:szCs w:val="28"/>
+          <w:lang w:val="ru-UA"/>
+        </w:rPr>
+        <w:t xml:space="preserve">я </w:t>
+      </w:r>
+      <w:r>
+        <w:rPr>
+          <w:sz w:val="28"/>
+          <w:szCs w:val="28"/>
+          <w:lang w:val="ru-UA"/>
+        </w:rPr>
+        <w:t>–</w:t>
+      </w:r>
+      <w:r>
+        <w:rPr>
+          <w:sz w:val="28"/>
+          <w:szCs w:val="28"/>
+          <w:lang w:val="ru-UA"/>
+        </w:rPr>
+        <w:t xml:space="preserve"> 1100</w:t>
+      </w:r>
+    </w:p>
+    <w:p>
+      <w:pPr>
+        <w:rPr>
+          <w:sz w:val="28"/>
+          <w:szCs w:val="28"/>
+          <w:lang w:val="ru-UA"/>
+        </w:rPr>
+      </w:pPr>
+      <w:r>
+        <w:rPr>
+          <w:sz w:val="28"/>
+          <w:szCs w:val="28"/>
+          <w:lang w:val="ru-UA"/>
+        </w:rPr>
+        <w:t xml:space="preserve">у </w:t>
+      </w:r>
+      <w:r>
+        <w:rPr>
+          <w:sz w:val="28"/>
+          <w:szCs w:val="28"/>
+          <w:lang w:val="ru-UA"/>
+        </w:rPr>
+        <w:t>–</w:t>
+      </w:r>
+      <w:r>
+        <w:rPr>
+          <w:sz w:val="28"/>
+          <w:szCs w:val="28"/>
+          <w:lang w:val="ru-UA"/>
+        </w:rPr>
+        <w:t xml:space="preserve"> 1000</w:t>
+      </w:r>
+    </w:p>
+    <w:p>
+      <w:pPr>
+        <w:rPr>
+          <w:sz w:val="28"/>
+          <w:szCs w:val="28"/>
+          <w:lang w:val="ru-UA"/>
+        </w:rPr>
+      </w:pPr>
+      <w:r>
+        <w:rPr>
+          <w:sz w:val="28"/>
+          <w:szCs w:val="28"/>
+          <w:lang w:val="ru-UA"/>
+        </w:rPr>
+        <w:t xml:space="preserve">ф </w:t>
+      </w:r>
+      <w:r>
+        <w:rPr>
+          <w:sz w:val="28"/>
+          <w:szCs w:val="28"/>
+          <w:lang w:val="ru-UA"/>
+        </w:rPr>
+        <w:t>–</w:t>
+      </w:r>
+      <w:r>
+        <w:rPr>
+          <w:sz w:val="28"/>
+          <w:szCs w:val="28"/>
+          <w:lang w:val="ru-UA"/>
+        </w:rPr>
+        <w:t xml:space="preserve"> 10011</w:t>
+      </w:r>
+    </w:p>
+    <w:p>
+      <w:pPr>
+        <w:rPr>
+          <w:sz w:val="28"/>
+          <w:szCs w:val="28"/>
+          <w:lang w:val="ru-UA"/>
+        </w:rPr>
+      </w:pPr>
+      <w:r>
+        <w:rPr>
+          <w:sz w:val="28"/>
+          <w:szCs w:val="28"/>
+          <w:lang w:val="ru-UA"/>
+        </w:rPr>
+        <w:t xml:space="preserve">ц </w:t>
+      </w:r>
+      <w:r>
+        <w:rPr>
+          <w:sz w:val="28"/>
+          <w:szCs w:val="28"/>
+          <w:lang w:val="ru-UA"/>
+        </w:rPr>
+        <w:t>–</w:t>
+      </w:r>
+      <w:r>
+        <w:rPr>
+          <w:sz w:val="28"/>
+          <w:szCs w:val="28"/>
+          <w:lang w:val="ru-UA"/>
+        </w:rPr>
+        <w:t xml:space="preserve"> 10010</w:t>
+      </w:r>
+    </w:p>
+    <w:p>
+      <w:pPr>
+        <w:rPr>
+          <w:sz w:val="28"/>
+          <w:szCs w:val="28"/>
+          <w:lang w:val="uk-UA"/>
+        </w:rPr>
+      </w:pPr>
+    </w:p>
+    <w:p>
+      <w:pPr>
+        <w:rPr>
+          <w:sz w:val="28"/>
+          <w:szCs w:val="28"/>
+          <w:lang w:val="uk-UA"/>
+        </w:rPr>
+      </w:pPr>
+      <w:r>
+        <w:rPr>
+          <w:sz w:val="28"/>
+          <w:szCs w:val="28"/>
+          <w:lang w:val="uk-UA"/>
+        </w:rPr>
+        <w:t>2. Перерахуйте ознаки жадібного алгоритму:</w:t>
+      </w:r>
+    </w:p>
+    <w:p>
+      <w:pPr>
+        <w:rPr>
+          <w:b/>
+          <w:bCs/>
+          <w:sz w:val="28"/>
+          <w:szCs w:val="28"/>
+          <w:lang w:val="uk-UA"/>
+        </w:rPr>
+      </w:pPr>
+      <w:r>
+        <w:rPr>
+          <w:b/>
+          <w:bCs/>
+          <w:sz w:val="28"/>
+          <w:szCs w:val="28"/>
+          <w:lang w:val="uk-UA"/>
+        </w:rPr>
+        <w:t>а) задачу можна розбити на підзадачі;</w:t>
+      </w:r>
+    </w:p>
+    <w:p>
+      <w:pPr>
+        <w:rPr>
+          <w:b/>
+          <w:bCs/>
+          <w:sz w:val="28"/>
+          <w:szCs w:val="28"/>
+          <w:lang w:val="uk-UA"/>
+        </w:rPr>
+      </w:pPr>
+      <w:r>
+        <w:rPr>
+          <w:b/>
+          <w:bCs/>
+          <w:sz w:val="28"/>
+          <w:szCs w:val="28"/>
+          <w:lang w:val="uk-UA"/>
+        </w:rPr>
+        <w:t>б) величини, що розглядаються в задачі, можна дробити так само, як і</w:t>
+      </w:r>
+    </w:p>
+    <w:p>
+      <w:pPr>
+        <w:rPr>
+          <w:b/>
+          <w:bCs/>
+          <w:sz w:val="28"/>
+          <w:szCs w:val="28"/>
+          <w:lang w:val="uk-UA"/>
+        </w:rPr>
+      </w:pPr>
+      <w:r>
+        <w:rPr>
+          <w:b/>
+          <w:bCs/>
+          <w:sz w:val="28"/>
+          <w:szCs w:val="28"/>
+          <w:lang w:val="uk-UA"/>
+        </w:rPr>
+        <w:t>задачу, на елементарніші;</w:t>
+      </w:r>
+    </w:p>
+    <w:p>
+      <w:pPr>
+        <w:rPr>
+          <w:sz w:val="28"/>
+          <w:szCs w:val="28"/>
+          <w:lang w:val="uk-UA"/>
+        </w:rPr>
+      </w:pPr>
+      <w:r>
+        <w:rPr>
+          <w:sz w:val="28"/>
+          <w:szCs w:val="28"/>
+          <w:lang w:val="uk-UA"/>
+        </w:rPr>
+        <w:t>в) кожну підзадачу можна розв’язувати окремим методом;</w:t>
+      </w:r>
+    </w:p>
+    <w:p>
+      <w:pPr>
+        <w:rPr>
+          <w:b/>
+          <w:bCs/>
+          <w:sz w:val="28"/>
+          <w:szCs w:val="28"/>
+          <w:lang w:val="uk-UA"/>
+        </w:rPr>
+      </w:pPr>
+      <w:r>
+        <w:rPr>
+          <w:b/>
+          <w:bCs/>
+          <w:sz w:val="28"/>
+          <w:szCs w:val="28"/>
+          <w:lang w:val="uk-UA"/>
+        </w:rPr>
+        <w:t>г) сума оптимальних рішень для своїх підзадач дасть оптимальне</w:t>
+      </w:r>
+      <w:r>
+        <w:rPr>
+          <w:b/>
+          <w:bCs/>
+          <w:sz w:val="28"/>
+          <w:szCs w:val="28"/>
+          <w:lang w:val="uk-UA"/>
+        </w:rPr>
+        <w:t xml:space="preserve"> </w:t>
+      </w:r>
+      <w:r>
+        <w:rPr>
+          <w:b/>
+          <w:bCs/>
+          <w:sz w:val="28"/>
+          <w:szCs w:val="28"/>
+          <w:lang w:val="uk-UA"/>
+        </w:rPr>
+        <w:t>рішення для всієї задачі.</w:t>
       </w:r>
     </w:p>
     <w:sectPr>
@@ -450,7 +1046,6 @@
   <w:style w:type="character" w:default="1" w:styleId="a0">
     <w:name w:val="Default Paragraph Font"/>
     <w:uiPriority w:val="1"/>
-    <w:semiHidden/>
     <w:unhideWhenUsed/>
   </w:style>
   <w:style w:type="table" w:default="1" w:styleId="a1">

</xml_diff>